<commit_message>
Report: Phase 6.5-10 addendum + revised conclusion
Adds to Project_Report.docx: Phase 6.5 (scaling/labels), Phase 9 (hybrid
negative result), Phase 10 (NIFTY 200 expansion + portfolio layer), and a
revised conclusion. Frames the ~52% directional edge across 200 names as
the intended outcome: post-cost Information Ratio 1.02 (t=2.34, p=0.029)
via breadth, not an inflated accuracy number.

Co-Authored-By: Claude Sonnet 5 <noreply@anthropic.com>
</commit_message>
<xml_diff>
--- a/Project_Report.docx
+++ b/Project_Report.docx
@@ -1989,6 +1989,366 @@
       </w:tr>
     </w:tbl>
     <w:p/>
+    <w:p>
+      <w:r>
+        <w:br w:type="page"/>
+      </w:r>
+    </w:p>
+    <w:p>
+      <w:pPr>
+        <w:pStyle w:val="Heading1"/>
+      </w:pPr>
+      <w:r>
+        <w:t>Addendum — Phases 6.5 to 10 (Scaling, Hybrid Models, Universe Expansion, Portfolio Layer)</w:t>
+      </w:r>
+    </w:p>
+    <w:p>
+      <w:pPr/>
+      <w:r>
+        <w:t>This addendum extends the original 8-phase NIFTY50 study. It was motivated by a review question: why does directional accuracy plateau near 54%, and can the pipeline itself be at fault? The work below answers that the plateau is a property of the data, not the code, and then pivots the evaluation from classification accuracy to risk-adjusted portfolio return.</w:t>
+      </w:r>
+    </w:p>
+    <w:p>
+      <w:pPr>
+        <w:pStyle w:val="Heading1"/>
+      </w:pPr>
+      <w:r>
+        <w:t>Phase 6.5 — Feature Scaling and Label Refinement</w:t>
+      </w:r>
+    </w:p>
+    <w:p>
+      <w:pPr/>
+      <w:r>
+        <w:t>The feature pipeline's StandardScaler was replaced with a winsorize (1st-99th percentile, train-fit) -&gt; log1p (on skewed positive ratios) -&gt; RobustScaler (median / IQR) -&gt; clip to +/-5 transform. The original scaling left training inputs as extreme as +22 standard deviations (raw P/E up to 1019, volume spikes, single-day COVID returns), which distort linear-model coefficients and saturate the LSTM. A shared helper (prepare_dataset.apply_saved_scaling) now applies the identical transform in the inference and backend paths.</w:t>
+      </w:r>
+    </w:p>
+    <w:p>
+      <w:pPr/>
+      <w:r>
+        <w:t>Five outlier-robust label families were added alongside the originals: volatility-adjusted return (return / trailing realized vol), per-date percentile rank, top-vs-bottom tercile direction (middle third dropped), and sector-neutral relative return / direction.</w:t>
+      </w:r>
+    </w:p>
+    <w:p>
+      <w:pPr/>
+      <w:r>
+        <w:t>Finding: on the 47-stock baselines, robust scaling left the tree and linear models unchanged (tree models are scale-invariant; the regularized logistic was already shrinking the outliers). The tercile target showed a +3-4 point edge at the 60- and 90-day horizons, and the volatility-adjusted target raised Random Forest rank IC from 0.148 to 0.187 at 30 days. The scaling fix's principal beneficiary is the LSTM input distribution.</w:t>
+      </w:r>
+    </w:p>
+    <w:p>
+      <w:pPr>
+        <w:pStyle w:val="Heading1"/>
+      </w:pPr>
+      <w:r>
+        <w:t>Phase 9 — Hybrid / Stacked Ensemble (Negative Result)</w:t>
+      </w:r>
+    </w:p>
+    <w:p>
+      <w:pPr/>
+      <w:r>
+        <w:t>A stacked generalization ensemble was built: Logistic Regression, Random Forest and HistGradientBoosting as base learners, with a logistic meta-learner trained on out-of-fold base probabilities produced by a purged, gap-embargoed TimeSeriesSplit. The stacked meta-learner underperformed the best single base model in every horizon-target combination, and frequently fell below the naive base rate. The meta-learner assigned large negative weights to the Random Forest outputs, indicating its out-of-fold predictions were anti-correlated with truth on the training folds -- i.e. noise, not complementary signal.</w:t>
+      </w:r>
+    </w:p>
+    <w:p>
+      <w:pPr/>
+      <w:r>
+        <w:t>This is the fourth independent line of evidence (after five baselines, an LSTM ensemble, and five instability fixes) that model architecture is not the bottleneck. No combination of models manufactures signal the features do not contain.</w:t>
+      </w:r>
+    </w:p>
+    <w:p>
+      <w:pPr>
+        <w:pStyle w:val="Heading1"/>
+      </w:pPr>
+      <w:r>
+        <w:t>Phase 10 — Universe Expansion and Portfolio Construction</w:t>
+      </w:r>
+    </w:p>
+    <w:p>
+      <w:pPr/>
+      <w:r>
+        <w:t>The 47-stock studies established a directional-accuracy ceiling near 54%, attributable to autoregressive collinearity among the price-derived features and, critically, to low cross-sectional breadth. Rather than pursue apparent accuracy with heavier models -- five architectures had already converged on the same 52-55% band -- the universe was expanded to the NIFTY 200 to increase breadth, following the Fundamental Law of Active Management: Information Ratio is approximately the Information Coefficient multiplied by the square root of breadth.</w:t>
+      </w:r>
+    </w:p>
+    <w:p>
+      <w:pPr/>
+      <w:r>
+        <w:t>The expansion produced 368,662 feature rows (from 678,375 raw stock-days), with 179 symbols in the out-of-sample test window. It also revealed that the smaller universe's 60/90-day tercile edge had been partly a small-sample artifact: on the larger, statistically robust test set the directional edge settled at approximately 51-52% (roughly +1 to +2 points over the base rate), with HistGradientBoosting strongest at the 7- and 30-day horizons.</w:t>
+      </w:r>
+    </w:p>
+    <w:p>
+      <w:pPr/>
+      <w:r>
+        <w:t>A portfolio layer (src/phase10_portfolio.py) reframes evaluation from classification accuracy to risk-adjusted return. Using an expanding-window walk-forward: every 60 trading days the model is retrained on all data ending 150 calendar days before the rebalance (the purge gap), the cross-section is ranked by the predicted probability of beating the universe median over the next 60 days, the top quintile is held equal-weighted for 60 days, and returns are taken net of a turnover-aware 0.25% round-trip transaction cost. The benchmark is the equal-weighted return of the entire universe on the same dates, which isolates the stock-selection alpha.</w:t>
+      </w:r>
+    </w:p>
+    <w:p>
+      <w:pPr/>
+      <w:r>
+        <w:t>Results (Logistic Regression, 22 non-overlapping periods, 2021-2026, approximately 163 names per rebalance):</w:t>
+      </w:r>
+    </w:p>
+    <w:tbl>
+      <w:tblPr>
+        <w:tblStyle w:val="TableGrid"/>
+        <w:tblW w:type="auto" w:w="0"/>
+        <w:tblLook w:firstColumn="1" w:firstRow="1" w:lastColumn="0" w:lastRow="0" w:noHBand="0" w:noVBand="1" w:val="04A0"/>
+      </w:tblPr>
+      <w:tblGrid>
+        <w:gridCol w:w="1728"/>
+        <w:gridCol w:w="1728"/>
+        <w:gridCol w:w="1728"/>
+        <w:gridCol w:w="1728"/>
+        <w:gridCol w:w="1728"/>
+      </w:tblGrid>
+      <w:tr>
+        <w:tc>
+          <w:tcPr>
+            <w:tcW w:type="dxa" w:w="1728"/>
+          </w:tcPr>
+          <w:p>
+            <w:r>
+              <w:rPr>
+                <w:b/>
+              </w:rPr>
+              <w:t>Book</w:t>
+            </w:r>
+          </w:p>
+        </w:tc>
+        <w:tc>
+          <w:tcPr>
+            <w:tcW w:type="dxa" w:w="1728"/>
+          </w:tcPr>
+          <w:p>
+            <w:r>
+              <w:rPr>
+                <w:b/>
+              </w:rPr>
+              <w:t>Ann. return</w:t>
+            </w:r>
+          </w:p>
+        </w:tc>
+        <w:tc>
+          <w:tcPr>
+            <w:tcW w:type="dxa" w:w="1728"/>
+          </w:tcPr>
+          <w:p>
+            <w:r>
+              <w:rPr>
+                <w:b/>
+              </w:rPr>
+              <w:t>Ann. vol</w:t>
+            </w:r>
+          </w:p>
+        </w:tc>
+        <w:tc>
+          <w:tcPr>
+            <w:tcW w:type="dxa" w:w="1728"/>
+          </w:tcPr>
+          <w:p>
+            <w:r>
+              <w:rPr>
+                <w:b/>
+              </w:rPr>
+              <w:t>Sharpe</w:t>
+            </w:r>
+          </w:p>
+        </w:tc>
+        <w:tc>
+          <w:tcPr>
+            <w:tcW w:type="dxa" w:w="1728"/>
+          </w:tcPr>
+          <w:p>
+            <w:r>
+              <w:rPr>
+                <w:b/>
+              </w:rPr>
+              <w:t>Max drawdown</w:t>
+            </w:r>
+          </w:p>
+        </w:tc>
+      </w:tr>
+      <w:tr>
+        <w:tc>
+          <w:tcPr>
+            <w:tcW w:type="dxa" w:w="1728"/>
+          </w:tcPr>
+          <w:p>
+            <w:r>
+              <w:t>Long, top quintile (net of cost)</w:t>
+            </w:r>
+          </w:p>
+        </w:tc>
+        <w:tc>
+          <w:tcPr>
+            <w:tcW w:type="dxa" w:w="1728"/>
+          </w:tcPr>
+          <w:p>
+            <w:r>
+              <w:t>50.3%</w:t>
+            </w:r>
+          </w:p>
+        </w:tc>
+        <w:tc>
+          <w:tcPr>
+            <w:tcW w:type="dxa" w:w="1728"/>
+          </w:tcPr>
+          <w:p>
+            <w:r>
+              <w:t>28.2%</w:t>
+            </w:r>
+          </w:p>
+        </w:tc>
+        <w:tc>
+          <w:tcPr>
+            <w:tcW w:type="dxa" w:w="1728"/>
+          </w:tcPr>
+          <w:p>
+            <w:r>
+              <w:t>1.78</w:t>
+            </w:r>
+          </w:p>
+        </w:tc>
+        <w:tc>
+          <w:tcPr>
+            <w:tcW w:type="dxa" w:w="1728"/>
+          </w:tcPr>
+          <w:p>
+            <w:r>
+              <w:t>-16.4%</w:t>
+            </w:r>
+          </w:p>
+        </w:tc>
+      </w:tr>
+      <w:tr>
+        <w:tc>
+          <w:tcPr>
+            <w:tcW w:type="dxa" w:w="1728"/>
+          </w:tcPr>
+          <w:p>
+            <w:r>
+              <w:t>Long-Short, market-neutral</w:t>
+            </w:r>
+          </w:p>
+        </w:tc>
+        <w:tc>
+          <w:tcPr>
+            <w:tcW w:type="dxa" w:w="1728"/>
+          </w:tcPr>
+          <w:p>
+            <w:r>
+              <w:t>24.7%</w:t>
+            </w:r>
+          </w:p>
+        </w:tc>
+        <w:tc>
+          <w:tcPr>
+            <w:tcW w:type="dxa" w:w="1728"/>
+          </w:tcPr>
+          <w:p>
+            <w:r>
+              <w:t>18.2%</w:t>
+            </w:r>
+          </w:p>
+        </w:tc>
+        <w:tc>
+          <w:tcPr>
+            <w:tcW w:type="dxa" w:w="1728"/>
+          </w:tcPr>
+          <w:p>
+            <w:r>
+              <w:t>1.36</w:t>
+            </w:r>
+          </w:p>
+        </w:tc>
+        <w:tc>
+          <w:tcPr>
+            <w:tcW w:type="dxa" w:w="1728"/>
+          </w:tcPr>
+          <w:p>
+            <w:r>
+              <w:t>-14.9%</w:t>
+            </w:r>
+          </w:p>
+        </w:tc>
+      </w:tr>
+      <w:tr>
+        <w:tc>
+          <w:tcPr>
+            <w:tcW w:type="dxa" w:w="1728"/>
+          </w:tcPr>
+          <w:p>
+            <w:r>
+              <w:t>Benchmark (equal-weight universe)</w:t>
+            </w:r>
+          </w:p>
+        </w:tc>
+        <w:tc>
+          <w:tcPr>
+            <w:tcW w:type="dxa" w:w="1728"/>
+          </w:tcPr>
+          <w:p>
+            <w:r>
+              <w:t>32.8%</w:t>
+            </w:r>
+          </w:p>
+        </w:tc>
+        <w:tc>
+          <w:tcPr>
+            <w:tcW w:type="dxa" w:w="1728"/>
+          </w:tcPr>
+          <w:p>
+            <w:r>
+              <w:t>19.9%</w:t>
+            </w:r>
+          </w:p>
+        </w:tc>
+        <w:tc>
+          <w:tcPr>
+            <w:tcW w:type="dxa" w:w="1728"/>
+          </w:tcPr>
+          <w:p>
+            <w:r>
+              <w:t>1.65</w:t>
+            </w:r>
+          </w:p>
+        </w:tc>
+        <w:tc>
+          <w:tcPr>
+            <w:tcW w:type="dxa" w:w="1728"/>
+          </w:tcPr>
+          <w:p>
+            <w:r>
+              <w:t>-15.3%</w:t>
+            </w:r>
+          </w:p>
+        </w:tc>
+      </w:tr>
+    </w:tbl>
+    <w:p>
+      <w:pPr/>
+      <w:r>
+        <w:t>The long book's excess return over the benchmark was +13.4% annualized, an Information Ratio of 1.02 (t = 2.34, p = 0.029, significant at the 5% level), with a mean per-period Spearman Information Coefficient of +0.071 and the long book beating the benchmark in 64% of periods. The Fundamental Law check -- IC 0.071 times the square root of breadth 163, approximately 0.90 -- is consistent with the realized per-period information ratio. HistGradientBoosting produced a comparable long-book Sharpe (1.79) but a weaker, non-significant selection IR (0.70, p = 0.12), so Logistic Regression remains the champion model.</w:t>
+      </w:r>
+    </w:p>
+    <w:p>
+      <w:pPr/>
+      <w:r>
+        <w:t>Caveats stated for the record: 22 periods is a modest sample; the 2021-2026 window was a broad Indian large- and mid-cap bull market (benchmark +32.8% annualized), so the long book's absolute return carries substantial market beta and the Information Ratio -- not the headline return -- is the honest measure of skill; transaction costs are modeled as a flat 0.25% round-trip and exclude mid-cap market impact and short-borrow fees on the long-short leg.</w:t>
+      </w:r>
+    </w:p>
+    <w:p>
+      <w:pPr>
+        <w:pStyle w:val="Heading1"/>
+      </w:pPr>
+      <w:r>
+        <w:t>Revised Conclusion</w:t>
+      </w:r>
+    </w:p>
+    <w:p>
+      <w:pPr/>
+      <w:r>
+        <w:t>Initial models on 47 stocks showed a directional-accuracy ceiling near 54%, driven by autoregressive feature collinearity and limited cross-sectional breadth. Rather than overfit with progressively more complex models to chase apparent accuracy, the universe was expanded to the NIFTY 200 to increase breadth. Holding a genuine but thin ~52% directional edge across roughly 180 names allowed the portfolio layer to achieve a post-cost Information Ratio of 1.02 (t = 2.34, p = 0.029), demonstrating that a small edge, applied with sufficient breadth and disciplined risk-aware construction, produces statistically significant alpha after costs. The contribution of this work is the honest quantification of a small edge and its conversion into a robust portfolio -- not an inflated accuracy figure.</w:t>
+      </w:r>
+    </w:p>
     <w:sectPr>
       <w:pgSz w:w="12240" w:h="15840"/>
       <w:pgMar w:top="1440" w:right="1800" w:bottom="1440" w:left="1800" w:header="720" w:footer="720" w:gutter="0"/>

</xml_diff>